<commit_message>
Alinear informe y script a la PPT: 10 pruebas SEG (7 inseguras/3 conformes), SEG-07b y SEG-12
</commit_message>
<xml_diff>
--- a/EP3 - Guion de Defensa EP4 (con preguntas).docx
+++ b/EP3 - Guion de Defensa EP4 (con preguntas).docx
@@ -2727,7 +2727,7 @@
           <w:rFonts w:ascii="Arial" w:hAnsi="Arial"/>
           <w:sz w:val="22"/>
         </w:rPr>
-        <w:t xml:space="preserve"> sin cabecera Authorization: el servidor respondió 200 con los datos completos. Lo mismo ocurrió con usuarios, auditoría y roles (SEG-01, SEG-03, SEG-04, SEG-05).</w:t>
+        <w:t xml:space="preserve"> sin cabecera Authorization: el servidor respondió 200 con los datos completos. Lo mismo ocurrió con usuarios, auditoría y roles (SEG-01, SEG-02, SEG-03, SEG-04).</w:t>
       </w:r>
     </w:p>
     <w:p>
@@ -2844,7 +2844,7 @@
           <w:rFonts w:ascii="Arial" w:hAnsi="Arial"/>
           <w:sz w:val="22"/>
         </w:rPr>
-        <w:t>. Eso permite almacenar y distribuir malware desde la propia plataforma. Se confirmó con SEG-07b, SEG-08b y SEG-11a.</w:t>
+        <w:t>. Eso permite almacenar y distribuir malware desde la propia plataforma. Se confirmó con SEG-07b y SEG-01.</w:t>
       </w:r>
     </w:p>
     <w:p>
@@ -3175,7 +3175,7 @@
           <w:rFonts w:ascii="Arial" w:hAnsi="Arial"/>
           <w:sz w:val="22"/>
         </w:rPr>
-        <w:t>R: Los resultados de CP-010 y CP-011, las 7 pruebas de seguridad con resultado inseguro, los 4 incidentes CRITICO, la vulnerabilidad BLOCKER de SonarQube y el Security Rating E. Todo está en las secciones 5 y 6 del informe y en los anexos.</w:t>
+        <w:t>R: Los resultados de CP-010 y CP-011, 7 de las 10 pruebas SEG con resultado inseguro, los 4 incidentes CRITICO, la vulnerabilidad BLOCKER de SonarQube y el Security Rating E. Todo está en las secciones 5 y 6 del informe y en los anexos.</w:t>
       </w:r>
     </w:p>
     <w:p>

</xml_diff>

<commit_message>
Corregir informe EP3 segun retroalimentacion y agregar evidencias crudas
- Anexo F con peticiones curl y respuestas HTTP reales (14 casos CP y 13 bloques SEG)
- Matriz de trazabilidad con IDs reales del ERS y cobertura declarada (28,6 % plena, 42,9 % parcial)
- RF-5.2 corregido: PDF, DOC, PPT, JPG y PNG
- CP-013 de rendimiento (5 mediciones, promedio 4,011 s) registrado como FALLO
- CP-014 de usabilidad y accesibilidad (Lighthouse 0,96)
- Resumen: 14 casos, 11 pass / 3 fail (78,6 %); 12 incidentes
- Cronograma de ejecucion (3.5) y fecha/ejecutor en el detalle (5.2)
- Script de pruebas renumerado CP-001..CP-014
- PPT y guion de defensa sincronizados
</commit_message>
<xml_diff>
--- a/EP3 - Guion de Defensa EP4 (con preguntas).docx
+++ b/EP3 - Guion de Defensa EP4 (con preguntas).docx
@@ -84,7 +84,7 @@
           <w:b w:val="0"/>
           <w:sz w:val="24"/>
         </w:rPr>
-        <w:t>Fecha: 17 de octubre de 2026</w:t>
+        <w:t>Fecha: 29 de octubre de 2026 · versión revisada</w:t>
       </w:r>
     </w:p>
     <w:p>
@@ -1851,7 +1851,7 @@
           <w:i/>
           <w:sz w:val="20"/>
         </w:rPr>
-        <w:t>Trabajamos en dos ciclos: el Ciclo 1 fue un smoke test de funciones base; si fallaba, deteníamos la ejecución. El Ciclo 2 ejecutó 12 casos funcionales y de seguridad más pruebas complementarias. Los criterios de entrada exigían entorno desplegado, datos semilla y casos revisados; los de salida, el 100 % de los casos críticos ejecutados, sin defectos críticos abiertos y con evidencia registrada.</w:t>
+        <w:t>Trabajamos en dos ciclos: el Ciclo 1 fue un smoke test de funciones base; si fallaba, deteníamos la ejecución. El Ciclo 2 ejecutó 14 casos: 12 funcionales y de seguridad, más 2 no funcionales de rendimiento y usabilidad, y pruebas complementarias. Los criterios de entrada exigían entorno desplegado, datos semilla y casos revisados; los de salida, el 100 % de los casos críticos ejecutados, sin defectos críticos abiertos y con evidencia registrada. Cada caso registra fecha, ejecutor y la petición y respuesta real en el Anexo F.</w:t>
       </w:r>
     </w:p>
     <w:p>
@@ -1899,7 +1899,7 @@
           <w:i/>
           <w:sz w:val="20"/>
         </w:rPr>
-        <w:t>Diseñamos cinco tipos de prueba, cada uno justificado por el ERS. Funcionales para validar los requisitos RF-1 a RF-6: login, CRUD de clientes, contratos, usuarios, dashboard y auditoría. De seguridad para control de acceso, uploads, SQLi, CORS y fuerza bruta. De integración para verificar el flujo completo entre frontend, API y base de datos. De rendimiento para comparar los tiempos de respuesta con los umbrales NFR-PERF. Y de usabilidad, en una revisión acotada de los estados de interfaz.</w:t>
+        <w:t>Diseñamos cinco tipos de prueba, cada uno justificado por el ERS. Funcionales para validar los requisitos RF-1 a RF-6: login, CRUD de clientes, contratos, usuarios, dashboard y auditoría. De seguridad para control de acceso, uploads, SQLi, CORS y fuerza bruta. De integración para verificar el flujo completo entre frontend, API y base de datos. De rendimiento para comparar los tiempos de respuesta con los umbrales NFR-PERF, con cinco repeticiones por endpoint. Y de usabilidad y accesibilidad, con una lista de verificación sobre el login y una auditoría Lighthouse.</w:t>
       </w:r>
     </w:p>
     <w:p>
@@ -1995,7 +1995,7 @@
           <w:i/>
           <w:sz w:val="20"/>
         </w:rPr>
-        <w:t>Diseñamos y ejecutamos 12 casos: 10 aprobados, un 83 % de éxito, y 2 fallidos. Los fallos son CP-010, que aceptó un archivo ejecutable en la subida de documentos, y CP-011, que permitió leer datos de contratos sin token. Sumamos 10 pruebas de seguridad complementarias, de las cuales 7 arrojaron resultado inseguro. En total registramos 11 incidentes: 4 críticos, 5 graves, 1 moderado y 1 leve. ESLint reportó 14 problemas y SonarQube, 1 vulnerabilidad BLOCKER, 4 hotspots y 198 code smells. El tiempo de respuesta fue de 4 segundos por una latencia artificial en el código.</w:t>
+        <w:t>Diseñamos y ejecutamos 14 casos: 11 aprobados, un 78,6 % de éxito, y 3 fallidos. Los fallos son CP-010, que aceptó un archivo ejecutable en la subida de documentos; CP-011, que permitió leer datos de contratos sin token; y CP-013, que midió el rendimiento. Este último promedió 4,011 segundos en cinco mediciones, frente a un umbral de 300 milisegundos, por una latencia artificial de cuatro segundos en el código. CP-014, de usabilidad, aprobó con observaciones. Sumamos 10 pruebas de seguridad complementarias, de las cuales 7 arrojaron resultado inseguro. En total registramos 12 incidentes: 4 críticos, 6 graves, 1 moderado y 1 leve. ESLint reportó 14 problemas y SonarQube, 1 vulnerabilidad BLOCKER, 4 hotspots y 198 code smells.</w:t>
       </w:r>
     </w:p>
     <w:p>
@@ -2043,7 +2043,7 @@
           <w:i/>
           <w:sz w:val="20"/>
         </w:rPr>
-        <w:t>Estos son los casos que mejor resumen el resultado. CP-001 aprobó: el login válido emite el JWT. CP-010 falló: el sistema aceptó un archivo .exe y lo sirvió como PDF, lo que es un riesgo de malware. CP-011 falló: un GET a contratos sin token devolvió los datos completos, un IDOR clásico. CP-012 sí aprobó: el intento de inyección SQL fue rechazado con 401 porque las consultas están parametrizadas. SEG-12 mostró CORS abierto con Allow-Origin asterisco, y FN-02 midió 4,06 segundos frente a un umbral de 300 milisegundos.</w:t>
+        <w:t>Estos son los casos que mejor resumen el resultado. CP-001 aprobó: el login válido emite el JWT. CP-010 falló: el sistema aceptó un archivo .exe y lo sirvió como PDF, lo que es un riesgo de malware. CP-011 falló: un GET a contratos sin token devolvió los datos completos, un IDOR clásico. CP-012 sí aprobó: el intento de inyección SQL fue rechazado con 401 porque las consultas están parametrizadas. SEG-12 mostró CORS abierto con Allow-Origin asterisco, y CP-013 midió 4,011 segundos en promedio de cinco mediciones, frente a un umbral de 300 milisegundos.</w:t>
       </w:r>
     </w:p>
     <w:p>
@@ -2139,7 +2139,7 @@
           <w:i/>
           <w:sz w:val="20"/>
         </w:rPr>
-        <w:t>Clasificamos los 11 incidentes con una escala de cuatro niveles. CRITICO: 4 casos, que impiden operar o exponen datos sensibles —el acceso sin token, las credenciales en texto claro, la subida sin validación y el secreto en el código—. GRAVE: 5 casos, entre ellos el JWT_SECRET inseguro, el CORS abierto, la ausencia de rate-limit, los errores 500 y el uso de localStorage. MODERADO: la latencia artificial. Y LEVE: los code smells de ESLint. La regla que aplicamos es que un software con defectos CRITICO abiertos nunca debe certificarse.</w:t>
+        <w:t>Clasificamos los 12 incidentes con una escala de cuatro niveles. CRITICO: 4 casos, que impiden operar o exponen datos sensibles —el acceso sin token, las credenciales en texto claro, la subida sin validación y el secreto en el código—. GRAVE: 6 casos, entre ellos el JWT_SECRET inseguro, el CORS abierto, la ausencia de rate-limit, los errores 500, el uso de localStorage y la latencia artificial de cuatro segundos, que incumple NFR-PERF-1. MODERADO: el contraste insuficiente y el idioma incorrecto del login. Y LEVE: los code smells de ESLint. La regla que aplicamos es que un software con defectos CRITICO abiertos nunca debe certificarse.</w:t>
       </w:r>
     </w:p>
     <w:p>
@@ -2309,7 +2309,7 @@
           <w:i/>
           <w:sz w:val="20"/>
         </w:rPr>
-        <w:t>El criterio de certificación era tener el 100 % de los casos de seguridad críticos exitosos y ningún defecto crítico abierto. No se cumplió: fallaron CP-010 y CP-011 y quedan 4 incidentes CRITICO. Por eso el dictamen es NO CERTIFICADO. Las acciones correctivas prioritarias son: autenticación global en todos los endpoints, hash seguro de contraseñas, validación de archivos, secretos fuera del código, CORS restringido, rate-limit, transacciones y errores genéricos, cookies httpOnly y un Quality Gate de seguridad en CI.</w:t>
+        <w:t>El criterio de certificación era tener el 100 % de los casos de seguridad críticos exitosos y ningún defecto crítico abierto. No se cumplió: fallaron CP-010 y CP-011, ambos de seguridad, y CP-013 en rendimiento, y quedan 4 incidentes CRITICO. Por eso el dictamen es NO CERTIFICADO. Las acciones correctivas prioritarias son: autenticación global en todos los endpoints, hash seguro de contraseñas, validación de archivos limitada a PDF, DOC, PPT, JPG y PNG, secretos fuera del código, CORS restringido, rate-limit, transacciones y errores genéricos, cookies httpOnly y un Quality Gate de seguridad en CI. También eliminar la latencia artificial y corregir contraste e idioma antes de volver a medir.</w:t>
       </w:r>
     </w:p>
     <w:p>
@@ -2398,7 +2398,7 @@
           <w:b/>
           <w:sz w:val="22"/>
         </w:rPr>
-        <w:t>P: ¿Por qué el dictamen es NO CERTIFICADO si el 83 % de los casos pasó?</w:t>
+        <w:t>P: ¿Por qué el dictamen es NO CERTIFICADO si el 78,6 % de los casos pasó?</w:t>
       </w:r>
     </w:p>
     <w:p>
@@ -2410,7 +2410,7 @@
           <w:rFonts w:ascii="Arial" w:hAnsi="Arial"/>
           <w:sz w:val="22"/>
         </w:rPr>
-        <w:t>R: Porque el criterio de certificación no es el promedio, sino dos condiciones obligatorias: el 100 % de los casos de seguridad críticos exitosos y ningún defecto de severidad crítica abierto. Fallaron CP-010 y CP-011, ambos de seguridad, y quedan 4 incidentes CRITICO. Un software con defectos críticos abiertos nunca debe certificarse.</w:t>
+        <w:t>R: Porque el criterio de certificación no es el promedio, sino dos condiciones obligatorias: el 100 % de los casos de seguridad críticos exitosos y ningún defecto de severidad crítica abierto. Fallaron CP-010 y CP-011, ambos de seguridad, y CP-013 de rendimiento, y quedan 4 incidentes CRITICO. Un software con defectos críticos abiertos nunca debe certificarse.</w:t>
       </w:r>
     </w:p>
     <w:p>
@@ -2423,7 +2423,7 @@
           <w:b/>
           <w:sz w:val="22"/>
         </w:rPr>
-        <w:t>P: ¿Cómo se calculó la cobertura del 100 % del ERS?</w:t>
+        <w:t>P: ¿Qué cobertura del ERS alcanzaron?</w:t>
       </w:r>
     </w:p>
     <w:p>
@@ -2435,7 +2435,7 @@
           <w:rFonts w:ascii="Arial" w:hAnsi="Arial"/>
           <w:sz w:val="22"/>
         </w:rPr>
-        <w:t>R: Con una matriz de trazabilidad bidireccional: los 12 requisitos evaluados (RQ-01 a RQ-12) se vincularon a 12 casos de prueba (CP-001 a CP-012), cada uno con resultado y defecto asociado. La matriz está en la sección 4.2 del informe.</w:t>
+        <w:t>R: No declaramos cobertura total. Como el ERS completo no estaba en el repositorio, la matriz de la sección 4.2 se limita a 21 requisitos identificables desde el EP1, el código y las guías, con sus identificadores reales: RF-1.1, RF-4, RF-5.2, RF-6.1, NFR-PERF-1, NFR-SEG-4, RB-2 y otros. De esos 21, 6 están cubiertos plenamente (28,6 %), 9 parcialmente (42,9 %) y 6 no se verificaron (28,6 %). Además, cobertura no es conformidad: CP-010, CP-011 y CP-013 cubren requisitos y aun así fallaron.</w:t>
       </w:r>
     </w:p>
     <w:p>
@@ -2485,7 +2485,7 @@
           <w:rFonts w:ascii="Arial" w:hAnsi="Arial"/>
           <w:sz w:val="22"/>
         </w:rPr>
-        <w:t>R: El Ciclo 1 es un smoke test: si las funciones base fallan, no tiene sentido ejecutar el resto. El Ciclo 2 profundiza con los 12 casos y las pruebas complementarias. Es una práctica estándar de ISTQB para optimizar tiempo y aislar fallos.</w:t>
+        <w:t>R: El Ciclo 1 es un smoke test: si las funciones base fallan, no tiene sentido ejecutar el resto. El Ciclo 2 profundiza con los 14 casos y las pruebas complementarias. Es una práctica estándar de ISTQB para optimizar tiempo y aislar fallos.</w:t>
       </w:r>
     </w:p>
     <w:p>
@@ -2857,6 +2857,31 @@
           <w:b/>
           <w:sz w:val="22"/>
         </w:rPr>
+        <w:t>P: ¿El ERS exige que solo se acepten PDF?</w:t>
+      </w:r>
+    </w:p>
+    <w:p>
+      <w:pPr>
+        <w:spacing w:line="360" w:lineRule="auto"/>
+      </w:pPr>
+      <w:r>
+        <w:rPr>
+          <w:rFonts w:ascii="Arial" w:hAnsi="Arial"/>
+          <w:sz w:val="22"/>
+        </w:rPr>
+        <w:t>R: No. RF-5.2 admite PDF, DOC, PPT, JPG y PNG. El defecto no es rechazar otros formatos, sino aceptar ejecutables y HTML sin validar extensión, tipo MIME ni contenido real. La propia interfaz se contradice: una pantalla dice "PDF, DOC, DOCX, XLS o XLSX" y otra dice "solo PDF", mientras el backend no aplica ningún filtro. Por eso el criterio de CP-010 se fijó sobre los cinco formatos del ERS.</w:t>
+      </w:r>
+    </w:p>
+    <w:p>
+      <w:pPr>
+        <w:spacing w:line="360" w:lineRule="auto"/>
+      </w:pPr>
+      <w:r>
+        <w:rPr>
+          <w:rFonts w:ascii="Arial" w:hAnsi="Arial"/>
+          <w:b/>
+          <w:sz w:val="22"/>
+        </w:rPr>
         <w:t>P: ¿Qué riesgo genera un CORS con asterisco?</w:t>
       </w:r>
     </w:p>
@@ -3150,7 +3175,7 @@
           <w:rFonts w:ascii="Arial" w:hAnsi="Arial"/>
           <w:sz w:val="22"/>
         </w:rPr>
-        <w:t>R: Es funcional en su base: 10 de 12 casos aprobados. El problema no es que no funcione, sino que no es seguro para producción. Un sistema puede ser funcional y aun así no ser certificable.</w:t>
+        <w:t>R: Es funcional en su base: 11 de 14 casos aprobados. El problema no es que no funcione, sino que no es seguro para producción. Un sistema puede ser funcional y aun así no ser certificable.</w:t>
       </w:r>
     </w:p>
     <w:p>

</xml_diff>